<commit_message>
feat/flujo de ventas y datos de traspaso incluidos en contrato autonmaticos
</commit_message>
<xml_diff>
--- a/app/plantillas/contrato_compra.docx
+++ b/app/plantillas/contrato_compra.docx
@@ -55,298 +55,388 @@
         <w:t xml:space="preserve">Por medio de este documento, conste que entre las partes. </w:t>
       </w:r>
     </w:p>
+    <w:tbl>
+      <w:tblPr>
+        <w:tblW w:type="auto" w:w="0"/>
+        <w:tblBorders>
+          <w:top w:val="none"/>
+          <w:left w:val="none"/>
+          <w:bottom w:val="none"/>
+          <w:right w:val="none"/>
+          <w:insideH w:val="none"/>
+          <w:insideV w:val="none"/>
+        </w:tblBorders>
+        <w:tblLook w:firstColumn="1" w:firstRow="1" w:lastColumn="0" w:lastRow="0" w:noHBand="0" w:noVBand="1" w:val="04A0"/>
+      </w:tblPr>
+      <w:tblGrid>
+        <w:gridCol w:w="4419"/>
+        <w:gridCol w:w="4419"/>
+      </w:tblGrid>
+      <w:tr>
+        <w:trPr>
+          <w:cantSplit/>
+        </w:trPr>
+        <w:tc>
+          <w:tcPr>
+            <w:tcW w:type="dxa" w:w="4419"/>
+          </w:tcPr>
+          <w:p>
+            <w:pPr>
+              <w:jc w:val="both"/>
+              <w:rPr>
+                <w:b/>
+              </w:rPr>
+            </w:pPr>
+            <w:r>
+              <w:rPr>
+                <w:b/>
+              </w:rPr>
+              <w:t xml:space="preserve">VENDEDOR: {{ vendedor }}</w:t>
+            </w:r>
+          </w:p>
+          <w:p>
+            <w:pPr>
+              <w:jc w:val="both"/>
+              <w:rPr>
+                <w:b/>
+              </w:rPr>
+            </w:pPr>
+            <w:r>
+              <w:rPr>
+                <w:b/>
+              </w:rPr>
+              <w:t xml:space="preserve">CC: {{ cedula }}</w:t>
+            </w:r>
+          </w:p>
+        </w:tc>
+        <w:tc>
+          <w:tcPr>
+            <w:tcW w:type="dxa" w:w="4419"/>
+          </w:tcPr>
+          <w:p>
+            <w:pPr>
+              <w:jc w:val="both"/>
+              <w:rPr>
+                <w:b/>
+              </w:rPr>
+            </w:pPr>
+            <w:r>
+              <w:rPr>
+                <w:b/>
+              </w:rPr>
+              <w:t xml:space="preserve">COMPRADOR: UNIVERSAL MOTORS </w:t>
+            </w:r>
+          </w:p>
+          <w:p>
+            <w:pPr>
+              <w:jc w:val="both"/>
+            </w:pPr>
+            <w:r>
+              <w:rPr>
+                <w:b/>
+              </w:rPr>
+              <w:t xml:space="preserve">NIT: </w:t>
+            </w:r>
+            <w:r>
+              <w:t xml:space="preserve"> {{ nit }}</w:t>
+            </w:r>
+          </w:p>
+        </w:tc>
+      </w:tr>
+    </w:tbl>
     <w:p>
       <w:pPr>
         <w:jc w:val="both"/>
-        <w:sectPr>
-          <w:pgSz w:w="12240" w:h="20160" w:code="5"/>
-          <w:pgMar w:top="1417" w:right="1701" w:bottom="1417" w:left="1701" w:header="708" w:footer="708" w:gutter="0"/>
-          <w:cols w:space="708"/>
-          <w:docGrid w:linePitch="360"/>
-        </w:sectPr>
-      </w:pPr>
-    </w:p>
-    <w:p>
-      <w:pPr>
-        <w:jc w:val="both"/>
+      </w:pPr>
+      <w:r>
+        <w:t xml:space="preserve">Como mutuo acuerdo de las partes y celebrando el presente contrato de compraventa, y regidos por las siguientes clausulas: </w:t>
+      </w:r>
+      <w:r>
         <w:rPr>
           <w:b/>
         </w:rPr>
-      </w:pPr>
-      <w:r>
-        <w:rPr>
-          <w:b/>
-        </w:rPr>
-        <w:t xml:space="preserve">VENDEDOR: {{ vendedor }}</w:t>
-      </w:r>
-    </w:p>
-    <w:p>
-      <w:pPr>
-        <w:jc w:val="both"/>
-        <w:rPr>
-          <w:b/>
-        </w:rPr>
-      </w:pPr>
-      <w:r>
-        <w:rPr>
-          <w:b/>
-        </w:rPr>
-        <w:t xml:space="preserve">CC: {{ cedula }}</w:t>
-      </w:r>
-    </w:p>
-    <w:p>
-      <w:pPr>
-        <w:jc w:val="both"/>
-        <w:rPr>
-          <w:b/>
-        </w:rPr>
-      </w:pPr>
-      <w:r>
-        <w:rPr>
-          <w:b/>
-        </w:rPr>
-        <w:t xml:space="preserve">COMPRADOR: UNIVERSAL MOTORS </w:t>
-      </w:r>
-    </w:p>
-    <w:p>
-      <w:pPr>
-        <w:jc w:val="both"/>
-        <w:sectPr>
-          <w:type w:val="continuous"/>
-          <w:pgSz w:w="12240" w:h="20160" w:code="5"/>
-          <w:pgMar w:top="1417" w:right="1701" w:bottom="1417" w:left="1701" w:header="708" w:footer="708" w:gutter="0"/>
-          <w:cols w:num="2" w:space="708"/>
-          <w:docGrid w:linePitch="360"/>
-        </w:sectPr>
-      </w:pPr>
-      <w:r>
-        <w:rPr>
-          <w:b/>
-        </w:rPr>
-        <w:t xml:space="preserve">NIT: </w:t>
-      </w:r>
-      <w:r>
-        <w:t xml:space="preserve"> {{ nit }}</w:t>
-      </w:r>
-    </w:p>
-    <w:p>
-      <w:pPr>
-        <w:jc w:val="both"/>
-      </w:pPr>
-      <w:r>
-        <w:t xml:space="preserve">Como mutuo acuerdo de las partes y celebrando el presente contrato de compraventa, y regidos por las siguientes clausulas: </w:t>
-      </w:r>
-      <w:r>
-        <w:rPr>
-          <w:b/>
-        </w:rPr>
         <w:t>PRIMERA CLAUSULA</w:t>
       </w:r>
       <w:r>
         <w:t>: El vendedor da en venta real y transfiere el material al comprador adquiriendo un vehículo automotor con las siguientes características:</w:t>
       </w:r>
     </w:p>
-    <w:p>
-      <w:pPr>
-        <w:jc w:val="both"/>
-        <w:sectPr>
-          <w:type w:val="continuous"/>
-          <w:pgSz w:w="12240" w:h="20160" w:code="5"/>
-          <w:pgMar w:top="1417" w:right="1701" w:bottom="1417" w:left="1701" w:header="708" w:footer="708" w:gutter="0"/>
-          <w:cols w:space="708"/>
-          <w:docGrid w:linePitch="360"/>
-        </w:sectPr>
-      </w:pPr>
-    </w:p>
-    <w:p>
-      <w:pPr>
-        <w:jc w:val="both"/>
-        <w:rPr>
-          <w:b/>
-        </w:rPr>
-      </w:pPr>
-      <w:r>
-        <w:rPr>
-          <w:b/>
-        </w:rPr>
-        <w:t xml:space="preserve">Placa: {{ placa }}</w:t>
-      </w:r>
-    </w:p>
-    <w:p>
-      <w:pPr>
-        <w:jc w:val="both"/>
-        <w:rPr>
-          <w:b/>
-        </w:rPr>
-      </w:pPr>
-      <w:r>
-        <w:rPr>
-          <w:b/>
-        </w:rPr>
-        <w:t xml:space="preserve">Clase: {{ clase }}</w:t>
-      </w:r>
-    </w:p>
-    <w:p>
-      <w:pPr>
-        <w:jc w:val="both"/>
-        <w:rPr>
-          <w:b/>
-        </w:rPr>
-      </w:pPr>
-      <w:r>
-        <w:rPr>
-          <w:b/>
-        </w:rPr>
-        <w:t xml:space="preserve">Marca: {{ marca }}</w:t>
-      </w:r>
-    </w:p>
-    <w:p>
-      <w:pPr>
-        <w:jc w:val="both"/>
-        <w:rPr>
-          <w:b/>
-        </w:rPr>
-      </w:pPr>
-      <w:r>
-        <w:rPr>
-          <w:b/>
-        </w:rPr>
-        <w:t xml:space="preserve">Línea: {{ linea }}</w:t>
-      </w:r>
-    </w:p>
-    <w:p>
-      <w:pPr>
-        <w:jc w:val="both"/>
-        <w:rPr>
-          <w:b/>
-        </w:rPr>
-      </w:pPr>
-      <w:r>
-        <w:rPr>
-          <w:b/>
-        </w:rPr>
-        <w:t xml:space="preserve">Modelo: {{ modelo }}</w:t>
-      </w:r>
-    </w:p>
-    <w:p>
-      <w:pPr>
-        <w:jc w:val="both"/>
-        <w:rPr>
-          <w:b/>
-        </w:rPr>
-      </w:pPr>
-      <w:r>
-        <w:rPr>
-          <w:b/>
-        </w:rPr>
-        <w:t xml:space="preserve">Color: {{ color }}</w:t>
-      </w:r>
-    </w:p>
-    <w:p>
-      <w:pPr>
-        <w:jc w:val="both"/>
-        <w:rPr>
-          <w:b/>
-        </w:rPr>
-      </w:pPr>
-      <w:r>
-        <w:rPr>
-          <w:b/>
-        </w:rPr>
-        <w:t xml:space="preserve">Matriculado en: {{ autoridad }}</w:t>
-      </w:r>
-    </w:p>
-    <w:p>
-      <w:pPr>
-        <w:jc w:val="both"/>
-        <w:rPr>
-          <w:b/>
-        </w:rPr>
-        <w:sectPr>
-          <w:type w:val="continuous"/>
-          <w:pgSz w:w="12240" w:h="20160" w:code="5"/>
-          <w:pgMar w:top="1417" w:right="1701" w:bottom="1417" w:left="1701" w:header="708" w:footer="708" w:gutter="0"/>
-          <w:cols w:num="2" w:space="708"/>
-          <w:docGrid w:linePitch="360"/>
-        </w:sectPr>
-      </w:pPr>
-      <w:r>
-        <w:rPr>
-          <w:b/>
-        </w:rPr>
-        <w:t xml:space="preserve">Tarjeta No: {{ tarjeta }}</w:t>
-      </w:r>
-    </w:p>
-    <w:p>
-      <w:pPr>
-        <w:jc w:val="both"/>
-        <w:rPr>
-          <w:b/>
-        </w:rPr>
-        <w:sectPr>
-          <w:type w:val="continuous"/>
-          <w:pgSz w:w="12240" w:h="20160" w:code="5"/>
-          <w:pgMar w:top="1417" w:right="1701" w:bottom="1417" w:left="1701" w:header="708" w:footer="708" w:gutter="0"/>
-          <w:cols w:space="708"/>
-          <w:docGrid w:linePitch="360"/>
-        </w:sectPr>
-      </w:pPr>
-      <w:r>
-        <w:rPr>
-          <w:b/>
-        </w:rPr>
-        <w:t xml:space="preserve">A nombre de: {{ propietario }}</w:t>
-      </w:r>
-    </w:p>
-    <w:p>
-      <w:pPr>
-        <w:jc w:val="both"/>
-        <w:rPr>
-          <w:b/>
-        </w:rPr>
-      </w:pPr>
-      <w:r>
-        <w:rPr>
-          <w:b/>
-        </w:rPr>
-        <w:t xml:space="preserve">No chasis: {{ chasis }}</w:t>
-      </w:r>
-    </w:p>
-    <w:p>
-      <w:pPr>
-        <w:jc w:val="both"/>
-        <w:rPr>
-          <w:b/>
-        </w:rPr>
-        <w:sectPr>
-          <w:type w:val="continuous"/>
-          <w:pgSz w:w="12240" w:h="20160" w:code="5"/>
-          <w:pgMar w:top="1417" w:right="1701" w:bottom="1417" w:left="1701" w:header="708" w:footer="708" w:gutter="0"/>
-          <w:cols w:num="2" w:space="708"/>
-          <w:docGrid w:linePitch="360"/>
-        </w:sectPr>
-      </w:pPr>
-      <w:r>
-        <w:rPr>
-          <w:b/>
-        </w:rPr>
-        <w:t xml:space="preserve">No motor: {{ motor }}</w:t>
-      </w:r>
-    </w:p>
-    <w:p>
-      <w:pPr>
-        <w:jc w:val="both"/>
-        <w:rPr>
-          <w:b/>
-        </w:rPr>
-      </w:pPr>
-      <w:r>
-        <w:rPr>
-          <w:b/>
-        </w:rPr>
-        <w:t xml:space="preserve">No serie: {{ serie }}</w:t>
-      </w:r>
-    </w:p>
+    <w:tbl>
+      <w:tblPr>
+        <w:tblW w:type="auto" w:w="0"/>
+        <w:tblBorders>
+          <w:top w:val="none"/>
+          <w:left w:val="none"/>
+          <w:bottom w:val="none"/>
+          <w:right w:val="none"/>
+          <w:insideH w:val="none"/>
+          <w:insideV w:val="none"/>
+        </w:tblBorders>
+        <w:tblLook w:firstColumn="1" w:firstRow="1" w:lastColumn="0" w:lastRow="0" w:noHBand="0" w:noVBand="1" w:val="04A0"/>
+      </w:tblPr>
+      <w:tblGrid>
+        <w:gridCol w:w="4419"/>
+        <w:gridCol w:w="4419"/>
+      </w:tblGrid>
+      <w:tr>
+        <w:trPr>
+          <w:cantSplit/>
+        </w:trPr>
+        <w:tc>
+          <w:tcPr>
+            <w:tcW w:type="dxa" w:w="4419"/>
+          </w:tcPr>
+          <w:p>
+            <w:pPr>
+              <w:jc w:val="both"/>
+              <w:rPr>
+                <w:b/>
+              </w:rPr>
+            </w:pPr>
+            <w:r>
+              <w:rPr>
+                <w:b/>
+              </w:rPr>
+              <w:t xml:space="preserve">Placa: {{ placa }}</w:t>
+            </w:r>
+          </w:p>
+        </w:tc>
+        <w:tc>
+          <w:tcPr>
+            <w:tcW w:type="dxa" w:w="4419"/>
+          </w:tcPr>
+          <w:p>
+            <w:pPr>
+              <w:jc w:val="both"/>
+              <w:rPr>
+                <w:b/>
+              </w:rPr>
+            </w:pPr>
+            <w:r>
+              <w:rPr>
+                <w:b/>
+              </w:rPr>
+              <w:t xml:space="preserve">Modelo: {{ modelo }}</w:t>
+            </w:r>
+          </w:p>
+        </w:tc>
+      </w:tr>
+      <w:tr>
+        <w:trPr>
+          <w:cantSplit/>
+        </w:trPr>
+        <w:tc>
+          <w:tcPr>
+            <w:tcW w:type="dxa" w:w="4419"/>
+          </w:tcPr>
+          <w:p>
+            <w:pPr>
+              <w:jc w:val="both"/>
+              <w:rPr>
+                <w:b/>
+              </w:rPr>
+            </w:pPr>
+            <w:r>
+              <w:rPr>
+                <w:b/>
+              </w:rPr>
+              <w:t xml:space="preserve">Clase: {{ clase }}</w:t>
+            </w:r>
+          </w:p>
+        </w:tc>
+        <w:tc>
+          <w:tcPr>
+            <w:tcW w:type="dxa" w:w="4419"/>
+          </w:tcPr>
+          <w:p>
+            <w:pPr>
+              <w:jc w:val="both"/>
+              <w:rPr>
+                <w:b/>
+              </w:rPr>
+            </w:pPr>
+            <w:r>
+              <w:rPr>
+                <w:b/>
+              </w:rPr>
+              <w:t xml:space="preserve">Color: {{ color }}</w:t>
+            </w:r>
+          </w:p>
+        </w:tc>
+      </w:tr>
+      <w:tr>
+        <w:trPr>
+          <w:cantSplit/>
+        </w:trPr>
+        <w:tc>
+          <w:tcPr>
+            <w:tcW w:type="dxa" w:w="4419"/>
+          </w:tcPr>
+          <w:p>
+            <w:pPr>
+              <w:jc w:val="both"/>
+              <w:rPr>
+                <w:b/>
+              </w:rPr>
+            </w:pPr>
+            <w:r>
+              <w:rPr>
+                <w:b/>
+              </w:rPr>
+              <w:t xml:space="preserve">Marca: {{ marca }}</w:t>
+            </w:r>
+          </w:p>
+        </w:tc>
+        <w:tc>
+          <w:tcPr>
+            <w:tcW w:type="dxa" w:w="4419"/>
+          </w:tcPr>
+          <w:p>
+            <w:pPr>
+              <w:jc w:val="both"/>
+              <w:rPr>
+                <w:b/>
+              </w:rPr>
+            </w:pPr>
+            <w:r>
+              <w:rPr>
+                <w:b/>
+              </w:rPr>
+              <w:t xml:space="preserve">Matriculado en: {{ autoridad }}</w:t>
+            </w:r>
+          </w:p>
+        </w:tc>
+      </w:tr>
+      <w:tr>
+        <w:trPr>
+          <w:cantSplit/>
+        </w:trPr>
+        <w:tc>
+          <w:tcPr>
+            <w:tcW w:type="dxa" w:w="4419"/>
+          </w:tcPr>
+          <w:p>
+            <w:pPr>
+              <w:jc w:val="both"/>
+              <w:rPr>
+                <w:b/>
+              </w:rPr>
+            </w:pPr>
+            <w:r>
+              <w:rPr>
+                <w:b/>
+              </w:rPr>
+              <w:t xml:space="preserve">Línea: {{ linea }}</w:t>
+            </w:r>
+          </w:p>
+        </w:tc>
+        <w:tc>
+          <w:tcPr>
+            <w:tcW w:type="dxa" w:w="4419"/>
+          </w:tcPr>
+          <w:p>
+            <w:pPr>
+              <w:jc w:val="both"/>
+              <w:rPr>
+                <w:b/>
+              </w:rPr>
+            </w:pPr>
+            <w:r>
+              <w:rPr>
+                <w:b/>
+              </w:rPr>
+              <w:t xml:space="preserve">Tarjeta No: {{ tarjeta }}</w:t>
+            </w:r>
+          </w:p>
+        </w:tc>
+      </w:tr>
+      <w:tr>
+        <w:trPr>
+          <w:cantSplit/>
+        </w:trPr>
+        <w:tc>
+          <w:tcPr>
+            <w:tcW w:type="dxa" w:w="4419"/>
+          </w:tcPr>
+          <w:p>
+            <w:pPr>
+              <w:jc w:val="both"/>
+              <w:rPr>
+                <w:b/>
+              </w:rPr>
+            </w:pPr>
+            <w:r>
+              <w:rPr>
+                <w:b/>
+              </w:rPr>
+              <w:t xml:space="preserve">No chasis: {{ chasis }}</w:t>
+            </w:r>
+          </w:p>
+        </w:tc>
+        <w:tc>
+          <w:tcPr>
+            <w:tcW w:type="dxa" w:w="4419"/>
+          </w:tcPr>
+          <w:p>
+            <w:pPr>
+              <w:jc w:val="both"/>
+              <w:rPr>
+                <w:b/>
+              </w:rPr>
+            </w:pPr>
+            <w:r>
+              <w:rPr>
+                <w:b/>
+              </w:rPr>
+              <w:t xml:space="preserve">No motor: {{ motor }}</w:t>
+            </w:r>
+          </w:p>
+        </w:tc>
+      </w:tr>
+      <w:tr>
+        <w:trPr>
+          <w:cantSplit/>
+        </w:trPr>
+        <w:tc>
+          <w:tcPr>
+            <w:tcW w:type="dxa" w:w="4419"/>
+          </w:tcPr>
+          <w:p>
+            <w:pPr>
+              <w:jc w:val="both"/>
+              <w:rPr>
+                <w:b/>
+              </w:rPr>
+            </w:pPr>
+            <w:r>
+              <w:rPr>
+                <w:b/>
+              </w:rPr>
+              <w:t xml:space="preserve">No serie: {{ serie }}</w:t>
+            </w:r>
+          </w:p>
+        </w:tc>
+        <w:tc>
+          <w:tcPr>
+            <w:tcW w:type="dxa" w:w="4419"/>
+          </w:tcPr>
+          <w:p>
+            <w:pPr>
+              <w:jc w:val="both"/>
+              <w:rPr>
+                <w:b/>
+              </w:rPr>
+            </w:pPr>
+            <w:r>
+              <w:rPr>
+                <w:b/>
+              </w:rPr>
+              <w:t xml:space="preserve">A nombre de: {{ propietario }}</w:t>
+            </w:r>
+          </w:p>
+        </w:tc>
+      </w:tr>
+    </w:tbl>
     <w:p>
       <w:pPr>
         <w:jc w:val="both"/>
@@ -500,201 +590,147 @@
     <w:p>
       <w:pPr>
         <w:jc w:val="both"/>
-        <w:rPr>
-          <w:b/>
-        </w:rPr>
-        <w:sectPr>
-          <w:type w:val="continuous"/>
-          <w:pgSz w:w="12240" w:h="20160" w:code="5"/>
-          <w:pgMar w:top="1417" w:right="1701" w:bottom="1417" w:left="1701" w:header="708" w:footer="708" w:gutter="0"/>
-          <w:cols w:space="708"/>
-          <w:docGrid w:linePitch="360"/>
-        </w:sectPr>
-      </w:pPr>
-    </w:p>
-    <w:p>
-      <w:pPr>
-        <w:rPr>
-          <w:b/>
-        </w:rPr>
-      </w:pPr>
-    </w:p>
-    <w:p>
-      <w:pPr>
-        <w:rPr>
-          <w:b/>
-        </w:rPr>
-      </w:pPr>
-    </w:p>
-    <w:p>
-      <w:pPr>
-        <w:rPr>
-          <w:b/>
-        </w:rPr>
-        <w:sectPr>
-          <w:type w:val="continuous"/>
-          <w:pgSz w:w="12240" w:h="20160" w:code="5"/>
-          <w:pgMar w:top="1417" w:right="1701" w:bottom="1417" w:left="1701" w:header="708" w:footer="708" w:gutter="0"/>
-          <w:cols w:num="2" w:space="708"/>
-          <w:docGrid w:linePitch="360"/>
-        </w:sectPr>
-      </w:pPr>
-      <w:r>
-        <w:rPr>
-          <w:b/>
-        </w:rPr>
-        <w:br/>
-      </w:r>
-    </w:p>
-    <w:p>
-      <w:pPr>
-        <w:rPr>
-          <w:b/>
-        </w:rPr>
       </w:pPr>
     </w:p>
     <w:p>
       <w:pPr>
         <w:jc w:val="both"/>
-        <w:rPr>
-          <w:b/>
-        </w:rPr>
-      </w:pPr>
-      <w:r>
-        <w:rPr>
-          <w:b/>
-        </w:rPr>
-        <w:t>FIRMA______________</w:t>
-        <w:br/>
-        <w:t xml:space="preserve">VENDEDOR: {{ vendedor }}</w:t>
-      </w:r>
-    </w:p>
-    <w:p>
-      <w:pPr>
-        <w:jc w:val="both"/>
-        <w:rPr>
-          <w:b/>
-        </w:rPr>
-      </w:pPr>
-      <w:r>
-        <w:rPr>
-          <w:b/>
-        </w:rPr>
-        <w:t xml:space="preserve">CC: {{ cedula }}</w:t>
-      </w:r>
-    </w:p>
-    <w:p>
-      <w:pPr>
-        <w:jc w:val="both"/>
-        <w:rPr>
-          <w:b/>
-          <w:u w:val="single"/>
-        </w:rPr>
-      </w:pPr>
-      <w:r>
-        <w:rPr>
-          <w:b/>
-        </w:rPr>
-        <w:t xml:space="preserve">TELEFONO: {{ telefono }}</w:t>
-      </w:r>
-    </w:p>
-    <w:p>
-      <w:pPr>
-        <w:jc w:val="both"/>
-        <w:rPr>
-          <w:b/>
-        </w:rPr>
-      </w:pPr>
-    </w:p>
-    <w:p>
-      <w:pPr>
-        <w:jc w:val="both"/>
-        <w:rPr>
-          <w:b/>
-        </w:rPr>
-      </w:pPr>
-    </w:p>
-    <w:p>
-      <w:pPr>
-        <w:jc w:val="both"/>
-        <w:rPr>
-          <w:b/>
-        </w:rPr>
-      </w:pPr>
-      <w:r>
-        <w:rPr>
-          <w:b/>
-        </w:rPr>
-        <w:br/>
-        <w:br/>
-        <w:t>FIRMA______________</w:t>
-      </w:r>
-    </w:p>
-    <w:p>
-      <w:pPr>
-        <w:rPr>
-          <w:b/>
-        </w:rPr>
-      </w:pPr>
-      <w:r>
-        <w:t>UNIVERSAL MOTORS</w:t>
-      </w:r>
-    </w:p>
-    <w:p>
-      <w:pPr>
-        <w:rPr>
-          <w:b/>
-        </w:rPr>
-      </w:pPr>
-      <w:r>
-        <w:rPr>
-          <w:b/>
-        </w:rPr>
-        <w:t xml:space="preserve">COMPRADOR </w:t>
-      </w:r>
-    </w:p>
-    <w:p>
-      <w:pPr>
-        <w:jc w:val="both"/>
-        <w:sectPr>
-          <w:type w:val="continuous"/>
-          <w:pgSz w:w="12240" w:h="20160" w:code="5"/>
-          <w:pgMar w:top="1417" w:right="1701" w:bottom="1417" w:left="1701" w:header="708" w:footer="708" w:gutter="0"/>
-          <w:cols w:num="2" w:space="708"/>
-          <w:docGrid w:linePitch="360"/>
-        </w:sectPr>
-      </w:pPr>
-      <w:r>
-        <w:rPr>
-          <w:b/>
-          <w:color w:val="000000" w:themeColor="text1"/>
-        </w:rPr>
-        <w:t xml:space="preserve">NIT: </w:t>
-      </w:r>
-      <w:r>
-        <w:rPr>
-          <w:color w:val="000000" w:themeColor="text1"/>
-        </w:rPr>
-        <w:t xml:space="preserve">{{ nit }}</w:t>
-      </w:r>
-      <w:r>
-        <w:t xml:space="preserve"/>
-      </w:r>
-    </w:p>
-    <w:p>
-      <w:pPr>
-        <w:sectPr>
-          <w:pgSz w:w="12240" w:h="15840"/>
-          <w:pgMar w:top="1417" w:right="1701" w:bottom="1417" w:left="1701" w:header="708" w:footer="708" w:gutter="0"/>
-          <w:cols w:space="708"/>
-          <w:docGrid w:linePitch="360"/>
-        </w:sectPr>
-      </w:pPr>
-    </w:p>
-    <w:p/>
+      </w:pPr>
+    </w:p>
+    <w:tbl>
+      <w:tblPr>
+        <w:tblW w:type="auto" w:w="0"/>
+        <w:tblBorders>
+          <w:top w:val="none"/>
+          <w:left w:val="none"/>
+          <w:bottom w:val="none"/>
+          <w:right w:val="none"/>
+          <w:insideH w:val="none"/>
+          <w:insideV w:val="none"/>
+        </w:tblBorders>
+        <w:tblLook w:firstColumn="1" w:firstRow="1" w:lastColumn="0" w:lastRow="0" w:noHBand="0" w:noVBand="1" w:val="04A0"/>
+      </w:tblPr>
+      <w:tblGrid>
+        <w:gridCol w:w="4419"/>
+        <w:gridCol w:w="4419"/>
+      </w:tblGrid>
+      <w:tr>
+        <w:trPr>
+          <w:cantSplit/>
+        </w:trPr>
+        <w:tc>
+          <w:tcPr>
+            <w:tcW w:type="dxa" w:w="4419"/>
+          </w:tcPr>
+          <w:p>
+            <w:pPr>
+              <w:spacing w:after="0"/>
+              <w:jc w:val="both"/>
+            </w:pPr>
+            <w:r>
+              <w:rPr>
+                <w:b/>
+              </w:rPr>
+              <w:t xml:space="preserve">FIRMA______________</w:t>
+            </w:r>
+          </w:p>
+          <w:p>
+            <w:pPr>
+              <w:spacing w:after="0"/>
+              <w:jc w:val="both"/>
+            </w:pPr>
+            <w:r>
+              <w:rPr>
+                <w:b/>
+              </w:rPr>
+              <w:t xml:space="preserve">VENDEDOR: {{ vendedor }}</w:t>
+            </w:r>
+          </w:p>
+          <w:p>
+            <w:pPr>
+              <w:spacing w:after="0"/>
+              <w:jc w:val="both"/>
+            </w:pPr>
+            <w:r>
+              <w:rPr>
+                <w:b/>
+              </w:rPr>
+              <w:t xml:space="preserve">CC: {{ cedula }}</w:t>
+            </w:r>
+          </w:p>
+          <w:p>
+            <w:pPr>
+              <w:spacing w:after="0"/>
+              <w:jc w:val="both"/>
+            </w:pPr>
+            <w:r>
+              <w:rPr>
+                <w:b/>
+              </w:rPr>
+              <w:t xml:space="preserve">TELEFONO: {{ telefono }}</w:t>
+            </w:r>
+          </w:p>
+        </w:tc>
+        <w:tc>
+          <w:tcPr>
+            <w:tcW w:type="dxa" w:w="4419"/>
+          </w:tcPr>
+          <w:p>
+            <w:pPr>
+              <w:spacing w:after="0"/>
+              <w:jc w:val="both"/>
+            </w:pPr>
+            <w:r>
+              <w:rPr>
+                <w:b/>
+              </w:rPr>
+              <w:t xml:space="preserve">FIRMA______________</w:t>
+            </w:r>
+          </w:p>
+          <w:p>
+            <w:pPr>
+              <w:spacing w:after="0"/>
+              <w:jc w:val="both"/>
+            </w:pPr>
+            <w:r>
+              <w:rPr>
+                <w:b/>
+              </w:rPr>
+              <w:t xml:space="preserve">UNIVERSAL MOTORS</w:t>
+            </w:r>
+          </w:p>
+          <w:p>
+            <w:pPr>
+              <w:spacing w:after="0"/>
+              <w:jc w:val="both"/>
+            </w:pPr>
+            <w:r>
+              <w:rPr>
+                <w:b/>
+              </w:rPr>
+              <w:t xml:space="preserve">COMPRADOR</w:t>
+            </w:r>
+          </w:p>
+          <w:p>
+            <w:pPr>
+              <w:spacing w:after="0"/>
+              <w:jc w:val="both"/>
+            </w:pPr>
+            <w:r>
+              <w:rPr>
+                <w:b/>
+              </w:rPr>
+              <w:t xml:space="preserve">NIT: </w:t>
+            </w:r>
+            <w:r>
+              <w:t>{{ nit }}</w:t>
+            </w:r>
+          </w:p>
+        </w:tc>
+      </w:tr>
+    </w:tbl>
     <w:sectPr>
-      <w:type w:val="continuous"/>
-      <w:pgSz w:w="12240" w:h="15840"/>
+      <w:pgSz w:w="12240" w:h="20160" w:code="5"/>
       <w:pgMar w:top="1417" w:right="1701" w:bottom="1417" w:left="1701" w:header="708" w:footer="708" w:gutter="0"/>
       <w:cols w:space="708"/>
       <w:docGrid w:linePitch="360"/>

</xml_diff>